<commit_message>
feat(comentarios-gestor): aprimora survey e tratamento de não respondentes
Inclui seção específica para organizações sem resposta válida ao questionário, com campos de manifestação e upload de comprovação no LimeSurvey e no anexo DOCX.

Parametriza número, nome e e-mail da fiscalização nos textos de boas-vindas e encerramento do survey de comentários do gestor, com repasse pelo orquestrador.

Corrige geração de gráficos de achados para ignorar não respondentes, torna falhas de gráficos fatais no consolidado e remove warnings de variáveis internas dos templates individuais.
</commit_message>
<xml_diff>
--- a/scripts/resources/template-questionario-comentarios-gestor.docx
+++ b/scripts/resources/template-questionario-comentarios-gestor.docx
@@ -700,69 +700,8 @@
         <w:rPr/>
       </w:pPr>
       <w:r>
-        <w:rPr>
-          <w:rFonts w:ascii="Arial" w:hAnsi="Arial" w:eastAsia="Arial" w:cs="Arial"/>
-          <w:sz w:val="24"/>
-          <w:szCs w:val="24"/>
-          <w:highlight w:val="none"/>
-        </w:rPr>
-        <w:t xml:space="preserve">Este documento orienta a manifestação da </w:t>
+        <w:t>Este documento orienta a manifestação da {{ auditado.sigla }} na fase de comentários do gestor. Conforme o caso, a manifestação poderá tratar dos achados e situações de inadequação registrados no Relatório Individual Preliminar, dos itens avaliados como não conformes na etapa de avaliação das evidências ou da ausência de resposta válida ao questionário iGovTI 2026.</w:t>
       </w:r>
-      <w:r>
-        <w:rPr>
-          <w:rFonts w:ascii="Arial" w:hAnsi="Arial" w:eastAsia="Arial" w:cs="Arial"/>
-          <w:b/>
-          <w:sz w:val="24"/>
-          <w:szCs w:val="24"/>
-        </w:rPr>
-        <w:t xml:space="preserve">{{ </w:t>
-      </w:r>
-      <w:r>
-        <w:rPr>
-          <w:rFonts w:ascii="Arial" w:hAnsi="Arial" w:eastAsia="Arial" w:cs="Arial"/>
-          <w:b/>
-          <w:sz w:val="24"/>
-          <w:szCs w:val="24"/>
-        </w:rPr>
-        <w:t xml:space="preserve">auditado.sigla</w:t>
-      </w:r>
-      <w:r>
-        <w:rPr>
-          <w:rFonts w:ascii="Arial" w:hAnsi="Arial" w:eastAsia="Arial" w:cs="Arial"/>
-          <w:b/>
-          <w:sz w:val="24"/>
-          <w:szCs w:val="24"/>
-        </w:rPr>
-        <w:t xml:space="preserve"> }}</w:t>
-      </w:r>
-      <w:r>
-        <w:rPr>
-          <w:rFonts w:ascii="Arial" w:hAnsi="Arial" w:eastAsia="Arial" w:cs="Arial"/>
-          <w:sz w:val="24"/>
-          <w:szCs w:val="24"/>
-          <w:highlight w:val="none"/>
-        </w:rPr>
-        <w:t xml:space="preserve"> sobre os achados e as situações de inadequação registrados no Relatório Individual Preliminar, </w:t>
-      </w:r>
-      <w:r>
-        <w:rPr>
-          <w:rFonts w:ascii="Arial" w:hAnsi="Arial" w:eastAsia="Arial" w:cs="Arial"/>
-          <w:sz w:val="24"/>
-          <w:szCs w:val="24"/>
-          <w:highlight w:val="none"/>
-        </w:rPr>
-        <w:t xml:space="preserve">bem como sobre os itens avaliados como não conformes na etapa de avaliação das evidências</w:t>
-      </w:r>
-      <w:r>
-        <w:rPr>
-          <w:rFonts w:ascii="Arial" w:hAnsi="Arial" w:eastAsia="Arial" w:cs="Arial"/>
-          <w:sz w:val="24"/>
-          <w:szCs w:val="24"/>
-          <w:highlight w:val="none"/>
-        </w:rPr>
-        <w:t xml:space="preserve">.</w:t>
-      </w:r>
-      <w:r/>
     </w:p>
     <w:p>
       <w:pPr>
@@ -777,65 +716,7 @@
         </w:rPr>
       </w:pPr>
       <w:r>
-        <w:rPr>
-          <w:rFonts w:ascii="Arial" w:hAnsi="Arial" w:eastAsia="Arial" w:cs="Arial"/>
-          <w:sz w:val="24"/>
-          <w:szCs w:val="24"/>
-          <w:highlight w:val="none"/>
-        </w:rPr>
-        <w:t xml:space="preserve">A</w:t>
-      </w:r>
-      <w:r>
-        <w:rPr>
-          <w:rFonts w:ascii="Arial" w:hAnsi="Arial" w:eastAsia="Arial" w:cs="Arial"/>
-          <w:sz w:val="24"/>
-          <w:szCs w:val="24"/>
-          <w:highlight w:val="none"/>
-        </w:rPr>
-        <w:t xml:space="preserve"> manifestação deve ser apresentada no questionário eletrônico de comentários do gestor, observando-se as situações específicas indicadas para a organização. Para cada situação, a organização deverá informar se concorda ou discorda do apontamento e, quando </w:t>
-      </w:r>
-      <w:r>
-        <w:rPr>
-          <w:rFonts w:ascii="Arial" w:hAnsi="Arial" w:eastAsia="Arial" w:cs="Arial"/>
-          <w:sz w:val="24"/>
-          <w:szCs w:val="24"/>
-          <w:highlight w:val="none"/>
-        </w:rPr>
-        <w:t xml:space="preserve">couber, apresentar comentários, justificativas e documentação comprobatória.</w:t>
-      </w:r>
-      <w:r>
-        <w:rPr>
-          <w:rFonts w:ascii="Arial" w:hAnsi="Arial" w:eastAsia="Arial" w:cs="Arial"/>
-          <w:sz w:val="24"/>
-          <w:szCs w:val="24"/>
-          <w:highlight w:val="none"/>
-        </w:rPr>
-        <w:t xml:space="preserve"> </w:t>
-      </w:r>
-      <w:r>
-        <w:rPr>
-          <w:rFonts w:ascii="Arial" w:hAnsi="Arial" w:eastAsia="Arial" w:cs="Arial"/>
-          <w:sz w:val="24"/>
-          <w:szCs w:val="24"/>
-          <w:highlight w:val="none"/>
-        </w:rPr>
-        <w:t xml:space="preserve">Nas questões-base indicadas na seção de reavaliação de evidências, a organização poderá apresentar esclarecimentos, retificações ou evidência suplementar para reanálise dos itens avaliados como não conformes.</w:t>
-      </w:r>
-      <w:r>
-        <w:rPr>
-          <w:rFonts w:ascii="Arial" w:hAnsi="Arial" w:eastAsia="Arial" w:cs="Arial"/>
-          <w:sz w:val="24"/>
-          <w:szCs w:val="24"/>
-          <w:highlight w:val="none"/>
-        </w:rPr>
-      </w:r>
-      <w:r>
-        <w:rPr>
-          <w:rFonts w:ascii="Arial" w:hAnsi="Arial" w:eastAsia="Arial" w:cs="Arial"/>
-          <w:sz w:val="24"/>
-          <w:szCs w:val="24"/>
-          <w:highlight w:val="none"/>
-        </w:rPr>
+        <w:t>A manifestação deve ser apresentada no questionário eletrônico de comentários do gestor, observando-se apenas as seções disponibilizadas para a organização. Quando houver achados, a organização deverá informar se concorda ou discorda de cada situação apontada e, quando couber, apresentar comentários, justificativas e documentação comprobatória. Nas questões-base indicadas na seção de reavaliação de evidências, a organização poderá apresentar esclarecimentos, retificações ou evidência suplementar para reanálise dos itens avaliados como não conformes. Quando não houver resposta válida ao questionário iGovTI 2026, a manifestação deverá se limitar a esclarecimentos, comprovação de eventual envio anterior ou justificativa para a ausência de resposta.</w:t>
       </w:r>
     </w:p>
     <w:p>
@@ -851,55 +732,7 @@
         </w:rPr>
       </w:pPr>
       <w:r>
-        <w:rPr>
-          <w:rFonts w:ascii="Arial" w:hAnsi="Arial" w:eastAsia="Arial" w:cs="Arial"/>
-          <w:sz w:val="24"/>
-          <w:szCs w:val="24"/>
-          <w:highlight w:val="none"/>
-        </w:rPr>
-      </w:r>
-      <w:r>
-        <w:rPr>
-          <w:rFonts w:ascii="Arial" w:hAnsi="Arial" w:eastAsia="Arial" w:cs="Arial"/>
-          <w:sz w:val="24"/>
-          <w:szCs w:val="24"/>
-          <w:highlight w:val="none"/>
-        </w:rPr>
-        <w:t xml:space="preserve">E</w:t>
-      </w:r>
-      <w:r>
-        <w:rPr>
-          <w:rFonts w:ascii="Arial" w:hAnsi="Arial" w:eastAsia="Arial" w:cs="Arial"/>
-          <w:sz w:val="24"/>
-          <w:szCs w:val="24"/>
-          <w:highlight w:val="none"/>
-        </w:rPr>
-        <w:t xml:space="preserve">m caso de discordância quanto às situações apontadas, a organização deverá expor objetivamente os fundamentos da divergência e encaminhar documentação que corrobore a argumentação apresentada. Na seção de reavaliação de evidências, a apresentação de coment</w:t>
-      </w:r>
-      <w:r>
-        <w:rPr>
-          <w:rFonts w:ascii="Arial" w:hAnsi="Arial" w:eastAsia="Arial" w:cs="Arial"/>
-          <w:sz w:val="24"/>
-          <w:szCs w:val="24"/>
-          <w:highlight w:val="none"/>
-        </w:rPr>
-        <w:t xml:space="preserve">ários e de nova evidência é opcional e deve se limitar aos itens indicados para reanálise.</w:t>
-      </w:r>
-      <w:r>
-        <w:rPr>
-          <w:rFonts w:ascii="Arial" w:hAnsi="Arial" w:eastAsia="Arial" w:cs="Arial"/>
-          <w:sz w:val="24"/>
-          <w:szCs w:val="24"/>
-          <w:highlight w:val="none"/>
-        </w:rPr>
-      </w:r>
-      <w:r>
-        <w:rPr>
-          <w:rFonts w:ascii="Arial" w:hAnsi="Arial" w:eastAsia="Arial" w:cs="Arial"/>
-          <w:sz w:val="24"/>
-          <w:szCs w:val="24"/>
-          <w:highlight w:val="none"/>
-        </w:rPr>
+        <w:t>Em caso de discordância quanto às situações apontadas, a organização deverá expor objetivamente os fundamentos da divergência e encaminhar documentação que corrobore a argumentação apresentada. Na seção de reavaliação de evidências, a apresentação de comentários e de nova evidência é opcional e deve se limitar aos itens indicados para reanálise. Para organizações sem resposta válida, não haverá contestação de achados ou reavaliação de evidências, pois não houve resposta e documentação comprobatória avaliadas.</w:t>
       </w:r>
     </w:p>
     <w:p>
@@ -1083,6 +916,46 @@
           <w:sz w:val="24"/>
           <w:szCs w:val="24"/>
         </w:rPr>
+      </w:r>
+    </w:p>
+    <w:p>
+      <w:r>
+        <w:t>{% if auditado.status_avaliacao == "nao_respondente" %}</w:t>
+      </w:r>
+    </w:p>
+    <w:p>
+      <w:r>
+        <w:t>2. Manifestação sobre ausência de resposta ao questionário iGovTI 2026</w:t>
+      </w:r>
+    </w:p>
+    <w:p>
+      <w:r>
+        <w:t>Não foi identificada resposta válida ao questionário iGovTI 2026 para a {{ auditado.sigla }} nas bases processadas pela Equipe de Auditoria.</w:t>
+      </w:r>
+    </w:p>
+    <w:p>
+      <w:r>
+        <w:t>No questionário eletrônico de comentários do gestor, a organização poderá apresentar esclarecimentos, comprovação de eventual resposta encaminhada ou justificativa para a ausência de resposta válida.</w:t>
+      </w:r>
+    </w:p>
+    <w:p>
+      <w:r>
+        <w:t>A organização deverá selecionar a alternativa que melhor descreve sua manifestação: confirmação da ausência de resposta válida, informação de que houve encaminhamento anterior com apresentação de comprovação ou apresentação de justificativa para a ausência de resposta.</w:t>
+      </w:r>
+    </w:p>
+    <w:p>
+      <w:r>
+        <w:t>Caso informe encaminhamento anterior ou apresente justificativa, deverá registrar os esclarecimentos no campo textual correspondente, indicando data, protocolo, e-mail, processo ou outro elemento de comprovação, quando aplicável.</w:t>
+      </w:r>
+    </w:p>
+    <w:p>
+      <w:r>
+        <w:t>Caso necessário, poderá encaminhar um arquivo em formato PDF ou ZIP para comprovar a manifestação apresentada.</w:t>
+      </w:r>
+    </w:p>
+    <w:p>
+      <w:r>
+        <w:t>{% else %}</w:t>
       </w:r>
     </w:p>
     <w:p>
@@ -2413,6 +2286,11 @@
         <w:rPr>
           <w:lang w:val="en-US"/>
         </w:rPr>
+      </w:r>
+    </w:p>
+    <w:p>
+      <w:r>
+        <w:t>{% endif %} {# fim nao respondente #}</w:t>
       </w:r>
     </w:p>
     <w:p>

</xml_diff>